<commit_message>
fix(docx): update technical book page size
</commit_message>
<xml_diff>
--- a/samples/範例Word.docx
+++ b/samples/範例Word.docx
@@ -250,7 +250,7 @@
       <w:r>
         <w:t xml:space="preserve"> 行內程式碼，以及</w:t>
       </w:r>
-      <w:hyperlink w:history="1" r:id="rIdrkj9clwgrabxdkhy6rbvi">
+      <w:hyperlink w:history="1" r:id="rId_dye01ylsqoc-x-oc2_cr">
         <w:r>
           <w:rPr>
             <w:color w:val="2563EB"/>
@@ -578,7 +578,7 @@
     <w:tbl>
       <w:tblPr>
         <w:tblStyle w:val="TableGrid"/>
-        <w:tblW w:type="dxa" w:w="6638"/>
+        <w:tblW w:type="dxa" w:w="6978"/>
         <w:tblInd w:type="dxa" w:w="120"/>
         <w:tblBorders>
           <w:top w:val="single" w:color="auto" w:sz="4"/>
@@ -597,7 +597,7 @@
         </w:tblCellMar>
       </w:tblPr>
       <w:tblGrid>
-        <w:gridCol w:w="6638"/>
+        <w:gridCol w:w="6978"/>
       </w:tblGrid>
       <w:tr>
         <w:trPr>
@@ -606,7 +606,7 @@
         </w:trPr>
         <w:tc>
           <w:tcPr>
-            <w:tcW w:type="dxa" w:w="6638"/>
+            <w:tcW w:type="dxa" w:w="6978"/>
             <w:tcBorders>
               <w:top w:val="single" w:color="000000" w:sz="4"/>
               <w:left w:val="single" w:color="000000" w:sz="4"/>
@@ -618,6 +618,7 @@
           </w:tcPr>
           <w:p>
             <w:pPr>
+              <w:pStyle w:val="TableBody"/>
               <w:spacing w:after="60" w:line="276"/>
             </w:pPr>
             <w:r>
@@ -632,7 +633,7 @@
         </w:trPr>
         <w:tc>
           <w:tcPr>
-            <w:tcW w:type="dxa" w:w="6638"/>
+            <w:tcW w:type="dxa" w:w="6978"/>
             <w:tcBorders>
               <w:top w:val="single" w:color="000000" w:sz="4"/>
               <w:left w:val="single" w:color="000000" w:sz="4"/>
@@ -644,6 +645,7 @@
           </w:tcPr>
           <w:p>
             <w:pPr>
+              <w:pStyle w:val="TableBody"/>
               <w:spacing w:after="60" w:line="276"/>
             </w:pPr>
             <w:r>
@@ -661,7 +663,7 @@
     <w:tbl>
       <w:tblPr>
         <w:tblStyle w:val="TableGrid"/>
-        <w:tblW w:type="dxa" w:w="6638"/>
+        <w:tblW w:type="dxa" w:w="6978"/>
         <w:tblInd w:type="dxa" w:w="120"/>
         <w:tblBorders>
           <w:top w:val="single" w:color="auto" w:sz="4"/>
@@ -680,8 +682,8 @@
         </w:tblCellMar>
       </w:tblPr>
       <w:tblGrid>
-        <w:gridCol w:w="1700"/>
-        <w:gridCol w:w="4938"/>
+        <w:gridCol w:w="1787"/>
+        <w:gridCol w:w="5191"/>
       </w:tblGrid>
       <w:tr>
         <w:trPr>
@@ -690,7 +692,7 @@
         </w:trPr>
         <w:tc>
           <w:tcPr>
-            <w:tcW w:type="dxa" w:w="1700"/>
+            <w:tcW w:type="dxa" w:w="1787"/>
             <w:tcBorders>
               <w:top w:val="single" w:color="000000" w:sz="4"/>
               <w:left w:val="single" w:color="000000" w:sz="4"/>
@@ -702,6 +704,7 @@
           </w:tcPr>
           <w:p>
             <w:pPr>
+              <w:pStyle w:val="TableBody"/>
               <w:spacing w:after="60" w:line="276"/>
             </w:pPr>
             <w:r>
@@ -711,7 +714,7 @@
         </w:tc>
         <w:tc>
           <w:tcPr>
-            <w:tcW w:type="dxa" w:w="4938"/>
+            <w:tcW w:type="dxa" w:w="5191"/>
             <w:tcBorders>
               <w:top w:val="single" w:color="000000" w:sz="4"/>
               <w:left w:val="single" w:color="000000" w:sz="4"/>
@@ -723,6 +726,7 @@
           </w:tcPr>
           <w:p>
             <w:pPr>
+              <w:pStyle w:val="TableBody"/>
               <w:spacing w:after="60" w:line="276"/>
             </w:pPr>
             <w:r>
@@ -737,7 +741,7 @@
         </w:trPr>
         <w:tc>
           <w:tcPr>
-            <w:tcW w:type="dxa" w:w="1700"/>
+            <w:tcW w:type="dxa" w:w="1787"/>
             <w:tcBorders>
               <w:top w:val="single" w:color="000000" w:sz="4"/>
               <w:left w:val="single" w:color="000000" w:sz="4"/>
@@ -749,6 +753,7 @@
           </w:tcPr>
           <w:p>
             <w:pPr>
+              <w:pStyle w:val="TableBody"/>
               <w:spacing w:after="60" w:line="276"/>
             </w:pPr>
             <w:r>
@@ -758,7 +763,7 @@
         </w:tc>
         <w:tc>
           <w:tcPr>
-            <w:tcW w:type="dxa" w:w="4938"/>
+            <w:tcW w:type="dxa" w:w="5191"/>
             <w:tcBorders>
               <w:top w:val="single" w:color="000000" w:sz="4"/>
               <w:left w:val="single" w:color="000000" w:sz="4"/>
@@ -770,6 +775,7 @@
           </w:tcPr>
           <w:p>
             <w:pPr>
+              <w:pStyle w:val="TableBody"/>
               <w:spacing w:after="60" w:line="276"/>
             </w:pPr>
             <w:r>
@@ -787,7 +793,7 @@
     <w:tbl>
       <w:tblPr>
         <w:tblStyle w:val="TableGrid"/>
-        <w:tblW w:type="dxa" w:w="6638"/>
+        <w:tblW w:type="dxa" w:w="6978"/>
         <w:tblInd w:type="dxa" w:w="120"/>
         <w:tblBorders>
           <w:top w:val="single" w:color="auto" w:sz="4"/>
@@ -806,9 +812,9 @@
         </w:tblCellMar>
       </w:tblPr>
       <w:tblGrid>
-        <w:gridCol w:w="1531"/>
-        <w:gridCol w:w="2553"/>
-        <w:gridCol w:w="2554"/>
+        <w:gridCol w:w="1610"/>
+        <w:gridCol w:w="2683"/>
+        <w:gridCol w:w="2685"/>
       </w:tblGrid>
       <w:tr>
         <w:trPr>
@@ -817,7 +823,7 @@
         </w:trPr>
         <w:tc>
           <w:tcPr>
-            <w:tcW w:type="dxa" w:w="1531"/>
+            <w:tcW w:type="dxa" w:w="1610"/>
             <w:tcBorders>
               <w:top w:val="single" w:color="000000" w:sz="4"/>
               <w:left w:val="single" w:color="000000" w:sz="4"/>
@@ -829,6 +835,7 @@
           </w:tcPr>
           <w:p>
             <w:pPr>
+              <w:pStyle w:val="TableBody"/>
               <w:spacing w:after="60" w:line="276"/>
             </w:pPr>
             <w:r>
@@ -838,7 +845,7 @@
         </w:tc>
         <w:tc>
           <w:tcPr>
-            <w:tcW w:type="dxa" w:w="2553"/>
+            <w:tcW w:type="dxa" w:w="2683"/>
             <w:tcBorders>
               <w:top w:val="single" w:color="000000" w:sz="4"/>
               <w:left w:val="single" w:color="000000" w:sz="4"/>
@@ -850,6 +857,7 @@
           </w:tcPr>
           <w:p>
             <w:pPr>
+              <w:pStyle w:val="TableBody"/>
               <w:spacing w:after="60" w:line="276"/>
             </w:pPr>
             <w:r>
@@ -859,7 +867,7 @@
         </w:tc>
         <w:tc>
           <w:tcPr>
-            <w:tcW w:type="dxa" w:w="2554"/>
+            <w:tcW w:type="dxa" w:w="2685"/>
             <w:tcBorders>
               <w:top w:val="single" w:color="000000" w:sz="4"/>
               <w:left w:val="single" w:color="000000" w:sz="4"/>
@@ -871,6 +879,7 @@
           </w:tcPr>
           <w:p>
             <w:pPr>
+              <w:pStyle w:val="TableBody"/>
               <w:spacing w:after="60" w:line="276"/>
             </w:pPr>
             <w:r>
@@ -885,7 +894,7 @@
         </w:trPr>
         <w:tc>
           <w:tcPr>
-            <w:tcW w:type="dxa" w:w="1531"/>
+            <w:tcW w:type="dxa" w:w="1610"/>
             <w:tcBorders>
               <w:top w:val="single" w:color="000000" w:sz="4"/>
               <w:left w:val="single" w:color="000000" w:sz="4"/>
@@ -897,6 +906,7 @@
           </w:tcPr>
           <w:p>
             <w:pPr>
+              <w:pStyle w:val="TableBody"/>
               <w:spacing w:after="60" w:line="276"/>
             </w:pPr>
             <w:r>
@@ -906,7 +916,7 @@
         </w:tc>
         <w:tc>
           <w:tcPr>
-            <w:tcW w:type="dxa" w:w="2553"/>
+            <w:tcW w:type="dxa" w:w="2683"/>
             <w:tcBorders>
               <w:top w:val="single" w:color="000000" w:sz="4"/>
               <w:left w:val="single" w:color="000000" w:sz="4"/>
@@ -918,6 +928,7 @@
           </w:tcPr>
           <w:p>
             <w:pPr>
+              <w:pStyle w:val="TableBody"/>
               <w:spacing w:after="60" w:line="276"/>
             </w:pPr>
             <w:r>
@@ -927,7 +938,7 @@
         </w:tc>
         <w:tc>
           <w:tcPr>
-            <w:tcW w:type="dxa" w:w="2554"/>
+            <w:tcW w:type="dxa" w:w="2685"/>
             <w:tcBorders>
               <w:top w:val="single" w:color="000000" w:sz="4"/>
               <w:left w:val="single" w:color="000000" w:sz="4"/>
@@ -939,6 +950,7 @@
           </w:tcPr>
           <w:p>
             <w:pPr>
+              <w:pStyle w:val="TableBody"/>
               <w:spacing w:after="60" w:line="276"/>
             </w:pPr>
             <w:r>
@@ -956,7 +968,7 @@
     <w:tbl>
       <w:tblPr>
         <w:tblStyle w:val="TableGrid"/>
-        <w:tblW w:type="dxa" w:w="6638"/>
+        <w:tblW w:type="dxa" w:w="6978"/>
         <w:tblInd w:type="dxa" w:w="120"/>
         <w:tblBorders>
           <w:top w:val="single" w:color="auto" w:sz="4"/>
@@ -975,10 +987,10 @@
         </w:tblCellMar>
       </w:tblPr>
       <w:tblGrid>
-        <w:gridCol w:w="1134"/>
-        <w:gridCol w:w="1772"/>
-        <w:gridCol w:w="1772"/>
-        <w:gridCol w:w="1960"/>
+        <w:gridCol w:w="1192"/>
+        <w:gridCol w:w="1863"/>
+        <w:gridCol w:w="1863"/>
+        <w:gridCol w:w="2060"/>
       </w:tblGrid>
       <w:tr>
         <w:trPr>
@@ -987,7 +999,7 @@
         </w:trPr>
         <w:tc>
           <w:tcPr>
-            <w:tcW w:type="dxa" w:w="1134"/>
+            <w:tcW w:type="dxa" w:w="1192"/>
             <w:tcBorders>
               <w:top w:val="single" w:color="000000" w:sz="4"/>
               <w:left w:val="single" w:color="000000" w:sz="4"/>
@@ -999,6 +1011,7 @@
           </w:tcPr>
           <w:p>
             <w:pPr>
+              <w:pStyle w:val="TableBody"/>
               <w:spacing w:after="60" w:line="276"/>
             </w:pPr>
             <w:r>
@@ -1008,7 +1021,7 @@
         </w:tc>
         <w:tc>
           <w:tcPr>
-            <w:tcW w:type="dxa" w:w="1772"/>
+            <w:tcW w:type="dxa" w:w="1863"/>
             <w:tcBorders>
               <w:top w:val="single" w:color="000000" w:sz="4"/>
               <w:left w:val="single" w:color="000000" w:sz="4"/>
@@ -1020,6 +1033,7 @@
           </w:tcPr>
           <w:p>
             <w:pPr>
+              <w:pStyle w:val="TableBody"/>
               <w:spacing w:after="60" w:line="276"/>
             </w:pPr>
             <w:r>
@@ -1029,7 +1043,7 @@
         </w:tc>
         <w:tc>
           <w:tcPr>
-            <w:tcW w:type="dxa" w:w="1772"/>
+            <w:tcW w:type="dxa" w:w="1863"/>
             <w:tcBorders>
               <w:top w:val="single" w:color="000000" w:sz="4"/>
               <w:left w:val="single" w:color="000000" w:sz="4"/>
@@ -1041,6 +1055,7 @@
           </w:tcPr>
           <w:p>
             <w:pPr>
+              <w:pStyle w:val="TableBody"/>
               <w:spacing w:after="60" w:line="276"/>
             </w:pPr>
             <w:r>
@@ -1050,7 +1065,7 @@
         </w:tc>
         <w:tc>
           <w:tcPr>
-            <w:tcW w:type="dxa" w:w="1960"/>
+            <w:tcW w:type="dxa" w:w="2060"/>
             <w:tcBorders>
               <w:top w:val="single" w:color="000000" w:sz="4"/>
               <w:left w:val="single" w:color="000000" w:sz="4"/>
@@ -1062,6 +1077,7 @@
           </w:tcPr>
           <w:p>
             <w:pPr>
+              <w:pStyle w:val="TableBody"/>
               <w:spacing w:after="60" w:line="276"/>
             </w:pPr>
             <w:r>
@@ -1076,7 +1092,7 @@
         </w:trPr>
         <w:tc>
           <w:tcPr>
-            <w:tcW w:type="dxa" w:w="1134"/>
+            <w:tcW w:type="dxa" w:w="1192"/>
             <w:tcBorders>
               <w:top w:val="single" w:color="000000" w:sz="4"/>
               <w:left w:val="single" w:color="000000" w:sz="4"/>
@@ -1088,6 +1104,7 @@
           </w:tcPr>
           <w:p>
             <w:pPr>
+              <w:pStyle w:val="TableBody"/>
               <w:spacing w:after="60" w:line="276"/>
             </w:pPr>
             <w:r>
@@ -1097,7 +1114,7 @@
         </w:tc>
         <w:tc>
           <w:tcPr>
-            <w:tcW w:type="dxa" w:w="1772"/>
+            <w:tcW w:type="dxa" w:w="1863"/>
             <w:tcBorders>
               <w:top w:val="single" w:color="000000" w:sz="4"/>
               <w:left w:val="single" w:color="000000" w:sz="4"/>
@@ -1109,6 +1126,7 @@
           </w:tcPr>
           <w:p>
             <w:pPr>
+              <w:pStyle w:val="TableBody"/>
               <w:spacing w:after="60" w:line="276"/>
             </w:pPr>
             <w:r>
@@ -1118,7 +1136,7 @@
         </w:tc>
         <w:tc>
           <w:tcPr>
-            <w:tcW w:type="dxa" w:w="1772"/>
+            <w:tcW w:type="dxa" w:w="1863"/>
             <w:tcBorders>
               <w:top w:val="single" w:color="000000" w:sz="4"/>
               <w:left w:val="single" w:color="000000" w:sz="4"/>
@@ -1130,6 +1148,7 @@
           </w:tcPr>
           <w:p>
             <w:pPr>
+              <w:pStyle w:val="TableBody"/>
               <w:spacing w:after="60" w:line="276"/>
             </w:pPr>
             <w:r>
@@ -1139,7 +1158,7 @@
         </w:tc>
         <w:tc>
           <w:tcPr>
-            <w:tcW w:type="dxa" w:w="1960"/>
+            <w:tcW w:type="dxa" w:w="2060"/>
             <w:tcBorders>
               <w:top w:val="single" w:color="000000" w:sz="4"/>
               <w:left w:val="single" w:color="000000" w:sz="4"/>
@@ -1151,6 +1170,7 @@
           </w:tcPr>
           <w:p>
             <w:pPr>
+              <w:pStyle w:val="TableBody"/>
               <w:spacing w:after="60" w:line="276"/>
             </w:pPr>
             <w:r>
@@ -1168,7 +1188,7 @@
     <w:tbl>
       <w:tblPr>
         <w:tblStyle w:val="TableGrid"/>
-        <w:tblW w:type="dxa" w:w="6638"/>
+        <w:tblW w:type="dxa" w:w="6978"/>
         <w:tblInd w:type="dxa" w:w="120"/>
         <w:tblBorders>
           <w:top w:val="single" w:color="auto" w:sz="4"/>
@@ -1187,11 +1207,11 @@
         </w:tblCellMar>
       </w:tblPr>
       <w:tblGrid>
-        <w:gridCol w:w="1327"/>
-        <w:gridCol w:w="1327"/>
-        <w:gridCol w:w="1327"/>
-        <w:gridCol w:w="1327"/>
-        <w:gridCol w:w="1330"/>
+        <w:gridCol w:w="1395"/>
+        <w:gridCol w:w="1395"/>
+        <w:gridCol w:w="1395"/>
+        <w:gridCol w:w="1395"/>
+        <w:gridCol w:w="1398"/>
       </w:tblGrid>
       <w:tr>
         <w:trPr>
@@ -1200,7 +1220,7 @@
         </w:trPr>
         <w:tc>
           <w:tcPr>
-            <w:tcW w:type="dxa" w:w="1327"/>
+            <w:tcW w:type="dxa" w:w="1395"/>
             <w:tcBorders>
               <w:top w:val="single" w:color="000000" w:sz="4"/>
               <w:left w:val="single" w:color="000000" w:sz="4"/>
@@ -1212,6 +1232,7 @@
           </w:tcPr>
           <w:p>
             <w:pPr>
+              <w:pStyle w:val="TableBody"/>
               <w:spacing w:after="60" w:line="276"/>
             </w:pPr>
             <w:r>
@@ -1221,7 +1242,7 @@
         </w:tc>
         <w:tc>
           <w:tcPr>
-            <w:tcW w:type="dxa" w:w="1327"/>
+            <w:tcW w:type="dxa" w:w="1395"/>
             <w:tcBorders>
               <w:top w:val="single" w:color="000000" w:sz="4"/>
               <w:left w:val="single" w:color="000000" w:sz="4"/>
@@ -1233,6 +1254,7 @@
           </w:tcPr>
           <w:p>
             <w:pPr>
+              <w:pStyle w:val="TableBody"/>
               <w:spacing w:after="60" w:line="276"/>
             </w:pPr>
             <w:r>
@@ -1242,7 +1264,7 @@
         </w:tc>
         <w:tc>
           <w:tcPr>
-            <w:tcW w:type="dxa" w:w="1327"/>
+            <w:tcW w:type="dxa" w:w="1395"/>
             <w:tcBorders>
               <w:top w:val="single" w:color="000000" w:sz="4"/>
               <w:left w:val="single" w:color="000000" w:sz="4"/>
@@ -1254,6 +1276,7 @@
           </w:tcPr>
           <w:p>
             <w:pPr>
+              <w:pStyle w:val="TableBody"/>
               <w:spacing w:after="60" w:line="276"/>
             </w:pPr>
             <w:r>
@@ -1263,7 +1286,7 @@
         </w:tc>
         <w:tc>
           <w:tcPr>
-            <w:tcW w:type="dxa" w:w="1327"/>
+            <w:tcW w:type="dxa" w:w="1395"/>
             <w:tcBorders>
               <w:top w:val="single" w:color="000000" w:sz="4"/>
               <w:left w:val="single" w:color="000000" w:sz="4"/>
@@ -1275,6 +1298,7 @@
           </w:tcPr>
           <w:p>
             <w:pPr>
+              <w:pStyle w:val="TableBody"/>
               <w:spacing w:after="60" w:line="276"/>
             </w:pPr>
             <w:r>
@@ -1284,7 +1308,7 @@
         </w:tc>
         <w:tc>
           <w:tcPr>
-            <w:tcW w:type="dxa" w:w="1330"/>
+            <w:tcW w:type="dxa" w:w="1398"/>
             <w:tcBorders>
               <w:top w:val="single" w:color="000000" w:sz="4"/>
               <w:left w:val="single" w:color="000000" w:sz="4"/>
@@ -1296,6 +1320,7 @@
           </w:tcPr>
           <w:p>
             <w:pPr>
+              <w:pStyle w:val="TableBody"/>
               <w:spacing w:after="60" w:line="276"/>
             </w:pPr>
             <w:r>
@@ -1310,7 +1335,7 @@
         </w:trPr>
         <w:tc>
           <w:tcPr>
-            <w:tcW w:type="dxa" w:w="1327"/>
+            <w:tcW w:type="dxa" w:w="1395"/>
             <w:tcBorders>
               <w:top w:val="single" w:color="000000" w:sz="4"/>
               <w:left w:val="single" w:color="000000" w:sz="4"/>
@@ -1322,6 +1347,7 @@
           </w:tcPr>
           <w:p>
             <w:pPr>
+              <w:pStyle w:val="TableBody"/>
               <w:spacing w:after="60" w:line="276"/>
             </w:pPr>
             <w:r>
@@ -1331,7 +1357,7 @@
         </w:tc>
         <w:tc>
           <w:tcPr>
-            <w:tcW w:type="dxa" w:w="1327"/>
+            <w:tcW w:type="dxa" w:w="1395"/>
             <w:tcBorders>
               <w:top w:val="single" w:color="000000" w:sz="4"/>
               <w:left w:val="single" w:color="000000" w:sz="4"/>
@@ -1343,6 +1369,7 @@
           </w:tcPr>
           <w:p>
             <w:pPr>
+              <w:pStyle w:val="TableBody"/>
               <w:spacing w:after="60" w:line="276"/>
             </w:pPr>
             <w:r>
@@ -1352,7 +1379,7 @@
         </w:tc>
         <w:tc>
           <w:tcPr>
-            <w:tcW w:type="dxa" w:w="1327"/>
+            <w:tcW w:type="dxa" w:w="1395"/>
             <w:tcBorders>
               <w:top w:val="single" w:color="000000" w:sz="4"/>
               <w:left w:val="single" w:color="000000" w:sz="4"/>
@@ -1364,6 +1391,7 @@
           </w:tcPr>
           <w:p>
             <w:pPr>
+              <w:pStyle w:val="TableBody"/>
               <w:spacing w:after="60" w:line="276"/>
             </w:pPr>
             <w:r>
@@ -1373,7 +1401,7 @@
         </w:tc>
         <w:tc>
           <w:tcPr>
-            <w:tcW w:type="dxa" w:w="1327"/>
+            <w:tcW w:type="dxa" w:w="1395"/>
             <w:tcBorders>
               <w:top w:val="single" w:color="000000" w:sz="4"/>
               <w:left w:val="single" w:color="000000" w:sz="4"/>
@@ -1385,6 +1413,7 @@
           </w:tcPr>
           <w:p>
             <w:pPr>
+              <w:pStyle w:val="TableBody"/>
               <w:spacing w:after="60" w:line="276"/>
             </w:pPr>
             <w:r>
@@ -1394,7 +1423,7 @@
         </w:tc>
         <w:tc>
           <w:tcPr>
-            <w:tcW w:type="dxa" w:w="1330"/>
+            <w:tcW w:type="dxa" w:w="1398"/>
             <w:tcBorders>
               <w:top w:val="single" w:color="000000" w:sz="4"/>
               <w:left w:val="single" w:color="000000" w:sz="4"/>
@@ -1406,6 +1435,7 @@
           </w:tcPr>
           <w:p>
             <w:pPr>
+              <w:pStyle w:val="TableBody"/>
               <w:spacing w:after="60" w:line="276"/>
             </w:pPr>
             <w:r>
@@ -1423,7 +1453,7 @@
     <w:tbl>
       <w:tblPr>
         <w:tblStyle w:val="TableGrid"/>
-        <w:tblW w:type="dxa" w:w="6638"/>
+        <w:tblW w:type="dxa" w:w="6978"/>
         <w:tblInd w:type="dxa" w:w="120"/>
         <w:tblBorders>
           <w:top w:val="single" w:color="auto" w:sz="4"/>
@@ -1442,12 +1472,12 @@
         </w:tblCellMar>
       </w:tblPr>
       <w:tblGrid>
-        <w:gridCol w:w="1106"/>
-        <w:gridCol w:w="1106"/>
-        <w:gridCol w:w="1106"/>
-        <w:gridCol w:w="1106"/>
-        <w:gridCol w:w="1106"/>
-        <w:gridCol w:w="1108"/>
+        <w:gridCol w:w="1163"/>
+        <w:gridCol w:w="1163"/>
+        <w:gridCol w:w="1163"/>
+        <w:gridCol w:w="1163"/>
+        <w:gridCol w:w="1163"/>
+        <w:gridCol w:w="1163"/>
       </w:tblGrid>
       <w:tr>
         <w:trPr>
@@ -1456,7 +1486,7 @@
         </w:trPr>
         <w:tc>
           <w:tcPr>
-            <w:tcW w:type="dxa" w:w="1106"/>
+            <w:tcW w:type="dxa" w:w="1163"/>
             <w:tcBorders>
               <w:top w:val="single" w:color="000000" w:sz="4"/>
               <w:left w:val="single" w:color="000000" w:sz="4"/>
@@ -1468,6 +1498,7 @@
           </w:tcPr>
           <w:p>
             <w:pPr>
+              <w:pStyle w:val="TableBody"/>
               <w:spacing w:after="60" w:line="276"/>
             </w:pPr>
             <w:r>
@@ -1477,7 +1508,7 @@
         </w:tc>
         <w:tc>
           <w:tcPr>
-            <w:tcW w:type="dxa" w:w="1106"/>
+            <w:tcW w:type="dxa" w:w="1163"/>
             <w:tcBorders>
               <w:top w:val="single" w:color="000000" w:sz="4"/>
               <w:left w:val="single" w:color="000000" w:sz="4"/>
@@ -1489,6 +1520,7 @@
           </w:tcPr>
           <w:p>
             <w:pPr>
+              <w:pStyle w:val="TableBody"/>
               <w:spacing w:after="60" w:line="276"/>
             </w:pPr>
             <w:r>
@@ -1498,7 +1530,7 @@
         </w:tc>
         <w:tc>
           <w:tcPr>
-            <w:tcW w:type="dxa" w:w="1106"/>
+            <w:tcW w:type="dxa" w:w="1163"/>
             <w:tcBorders>
               <w:top w:val="single" w:color="000000" w:sz="4"/>
               <w:left w:val="single" w:color="000000" w:sz="4"/>
@@ -1510,6 +1542,7 @@
           </w:tcPr>
           <w:p>
             <w:pPr>
+              <w:pStyle w:val="TableBody"/>
               <w:spacing w:after="60" w:line="276"/>
             </w:pPr>
             <w:r>
@@ -1519,7 +1552,7 @@
         </w:tc>
         <w:tc>
           <w:tcPr>
-            <w:tcW w:type="dxa" w:w="1106"/>
+            <w:tcW w:type="dxa" w:w="1163"/>
             <w:tcBorders>
               <w:top w:val="single" w:color="000000" w:sz="4"/>
               <w:left w:val="single" w:color="000000" w:sz="4"/>
@@ -1531,6 +1564,7 @@
           </w:tcPr>
           <w:p>
             <w:pPr>
+              <w:pStyle w:val="TableBody"/>
               <w:spacing w:after="60" w:line="276"/>
             </w:pPr>
             <w:r>
@@ -1540,7 +1574,7 @@
         </w:tc>
         <w:tc>
           <w:tcPr>
-            <w:tcW w:type="dxa" w:w="1106"/>
+            <w:tcW w:type="dxa" w:w="1163"/>
             <w:tcBorders>
               <w:top w:val="single" w:color="000000" w:sz="4"/>
               <w:left w:val="single" w:color="000000" w:sz="4"/>
@@ -1552,6 +1586,7 @@
           </w:tcPr>
           <w:p>
             <w:pPr>
+              <w:pStyle w:val="TableBody"/>
               <w:spacing w:after="60" w:line="276"/>
             </w:pPr>
             <w:r>
@@ -1561,7 +1596,7 @@
         </w:tc>
         <w:tc>
           <w:tcPr>
-            <w:tcW w:type="dxa" w:w="1108"/>
+            <w:tcW w:type="dxa" w:w="1163"/>
             <w:tcBorders>
               <w:top w:val="single" w:color="000000" w:sz="4"/>
               <w:left w:val="single" w:color="000000" w:sz="4"/>
@@ -1573,6 +1608,7 @@
           </w:tcPr>
           <w:p>
             <w:pPr>
+              <w:pStyle w:val="TableBody"/>
               <w:spacing w:after="60" w:line="276"/>
             </w:pPr>
             <w:r>
@@ -1587,7 +1623,7 @@
         </w:trPr>
         <w:tc>
           <w:tcPr>
-            <w:tcW w:type="dxa" w:w="1106"/>
+            <w:tcW w:type="dxa" w:w="1163"/>
             <w:tcBorders>
               <w:top w:val="single" w:color="000000" w:sz="4"/>
               <w:left w:val="single" w:color="000000" w:sz="4"/>
@@ -1599,6 +1635,7 @@
           </w:tcPr>
           <w:p>
             <w:pPr>
+              <w:pStyle w:val="TableBody"/>
               <w:spacing w:after="60" w:line="276"/>
             </w:pPr>
             <w:r>
@@ -1608,7 +1645,7 @@
         </w:tc>
         <w:tc>
           <w:tcPr>
-            <w:tcW w:type="dxa" w:w="1106"/>
+            <w:tcW w:type="dxa" w:w="1163"/>
             <w:tcBorders>
               <w:top w:val="single" w:color="000000" w:sz="4"/>
               <w:left w:val="single" w:color="000000" w:sz="4"/>
@@ -1620,6 +1657,7 @@
           </w:tcPr>
           <w:p>
             <w:pPr>
+              <w:pStyle w:val="TableBody"/>
               <w:spacing w:after="60" w:line="276"/>
             </w:pPr>
             <w:r>
@@ -1629,7 +1667,7 @@
         </w:tc>
         <w:tc>
           <w:tcPr>
-            <w:tcW w:type="dxa" w:w="1106"/>
+            <w:tcW w:type="dxa" w:w="1163"/>
             <w:tcBorders>
               <w:top w:val="single" w:color="000000" w:sz="4"/>
               <w:left w:val="single" w:color="000000" w:sz="4"/>
@@ -1641,6 +1679,7 @@
           </w:tcPr>
           <w:p>
             <w:pPr>
+              <w:pStyle w:val="TableBody"/>
               <w:spacing w:after="60" w:line="276"/>
             </w:pPr>
             <w:r>
@@ -1650,7 +1689,7 @@
         </w:tc>
         <w:tc>
           <w:tcPr>
-            <w:tcW w:type="dxa" w:w="1106"/>
+            <w:tcW w:type="dxa" w:w="1163"/>
             <w:tcBorders>
               <w:top w:val="single" w:color="000000" w:sz="4"/>
               <w:left w:val="single" w:color="000000" w:sz="4"/>
@@ -1662,6 +1701,7 @@
           </w:tcPr>
           <w:p>
             <w:pPr>
+              <w:pStyle w:val="TableBody"/>
               <w:spacing w:after="60" w:line="276"/>
             </w:pPr>
             <w:r>
@@ -1671,7 +1711,7 @@
         </w:tc>
         <w:tc>
           <w:tcPr>
-            <w:tcW w:type="dxa" w:w="1106"/>
+            <w:tcW w:type="dxa" w:w="1163"/>
             <w:tcBorders>
               <w:top w:val="single" w:color="000000" w:sz="4"/>
               <w:left w:val="single" w:color="000000" w:sz="4"/>
@@ -1683,6 +1723,7 @@
           </w:tcPr>
           <w:p>
             <w:pPr>
+              <w:pStyle w:val="TableBody"/>
               <w:spacing w:after="60" w:line="276"/>
             </w:pPr>
             <w:r>
@@ -1692,7 +1733,7 @@
         </w:tc>
         <w:tc>
           <w:tcPr>
-            <w:tcW w:type="dxa" w:w="1108"/>
+            <w:tcW w:type="dxa" w:w="1163"/>
             <w:tcBorders>
               <w:top w:val="single" w:color="000000" w:sz="4"/>
               <w:left w:val="single" w:color="000000" w:sz="4"/>
@@ -1704,6 +1745,7 @@
           </w:tcPr>
           <w:p>
             <w:pPr>
+              <w:pStyle w:val="TableBody"/>
               <w:spacing w:after="60" w:line="276"/>
             </w:pPr>
             <w:r>
@@ -1945,7 +1987,7 @@
       <w:pPr>
         <w:jc w:val="center"/>
       </w:pPr>
-      <w:hyperlink w:history="1" r:id="rIdyyghzp28hynuxlxh91fhc">
+      <w:hyperlink w:history="1" r:id="rId8sz0kksstgvn6k58qtz6z">
         <w:r>
           <w:rPr>
             <w:color w:val="9B1C1C"/>
@@ -2043,7 +2085,7 @@
     <w:sectPr>
       <w:headerReference w:type="default" r:id="rId6"/>
       <w:footerReference w:type="default" r:id="rId7"/>
-      <w:pgSz w:w="9638" w:h="13039" w:orient="portrait"/>
+      <w:pgSz w:w="9978" w:h="13380" w:orient="portrait"/>
       <w:pgMar w:top="1440" w:right="1440" w:bottom="1440" w:left="1440" w:header="708" w:footer="708" w:gutter="0"/>
       <w:pgNumType/>
       <w:docGrid w:linePitch="360"/>
@@ -2545,5 +2587,20 @@
       <w:szCs w:val="18"/>
     </w:rPr>
   </w:style>
+  <w:style w:type="paragraph" w:styleId="TableBody">
+    <w:name w:val="Table Body"/>
+    <w:basedOn w:val="Normal"/>
+    <w:next w:val="Normal"/>
+    <w:qFormat/>
+    <w:pPr>
+      <w:spacing w:before="0" w:after="60" w:line="276" w:lineRule="auto"/>
+    </w:pPr>
+    <w:rPr>
+      <w:rFonts w:ascii="Calibri" w:hAnsi="Calibri" w:eastAsia="Noto Sans TC" w:cs="Noto Sans TC"/>
+      <w:color w:val="000000"/>
+      <w:sz w:val="20"/>
+      <w:szCs w:val="20"/>
+    </w:rPr>
+  </w:style>
 </w:styles>
 </file>
</xml_diff>